<commit_message>
chore: record pilot infrastructure and publish placeholder site
</commit_message>
<xml_diff>
--- a/docs/word/07-operations/01-razvertyvanie-i-ekspluataciya.docx
+++ b/docs/word/07-operations/01-razvertyvanie-i-ekspluataciya.docx
@@ -1079,7 +1079,60 @@
         <w:pStyle w:val="ListBullet"/>
       </w:pPr>
       <w:r>
-        <w:t xml:space="preserve">Тип: </w:t>
+        <w:t xml:space="preserve">Текущий тип: </w:t>
+      </w:r>
+      <w:r>
+        <w:rPr>
+          <w:b/>
+        </w:rPr>
+        <w:t>Static files</w:t>
+      </w:r>
+      <w:r>
+        <w:t xml:space="preserve"> — временная страница-заглушка.</w:t>
+      </w:r>
+    </w:p>
+    <w:p>
+      <w:pPr>
+        <w:pStyle w:val="ListBullet"/>
+      </w:pPr>
+      <w:r>
+        <w:t xml:space="preserve">Адрес пилота: </w:t>
+      </w:r>
+      <w:r>
+        <w:rPr>
+          <w:rFonts w:ascii="Consolas" w:hAnsi="Consolas"/>
+          <w:sz w:val="18"/>
+        </w:rPr>
+        <w:t>http://school-platform-v2.185.31.40.24.nip.io</w:t>
+      </w:r>
+      <w:r>
+        <w:t>.</w:t>
+      </w:r>
+    </w:p>
+    <w:p>
+      <w:pPr>
+        <w:pStyle w:val="ListBullet"/>
+      </w:pPr>
+      <w:r>
+        <w:t xml:space="preserve">Корень сайта: </w:t>
+      </w:r>
+      <w:r>
+        <w:rPr>
+          <w:rFonts w:ascii="Consolas" w:hAnsi="Consolas"/>
+          <w:sz w:val="18"/>
+        </w:rPr>
+        <w:t>/home/virusadk/school-platform-v2/public</w:t>
+      </w:r>
+      <w:r>
+        <w:t>.</w:t>
+      </w:r>
+    </w:p>
+    <w:p>
+      <w:pPr>
+        <w:pStyle w:val="ListBullet"/>
+      </w:pPr>
+      <w:r>
+        <w:t xml:space="preserve">После появления FastAPI: тип </w:t>
       </w:r>
       <w:r>
         <w:rPr>
@@ -1088,7 +1141,7 @@
         <w:t>User program</w:t>
       </w:r>
       <w:r>
-        <w:t xml:space="preserve"> (ASGI/Uvicorn) для FastAPI.</w:t>
+        <w:t xml:space="preserve"> (ASGI/Uvicorn).</w:t>
       </w:r>
     </w:p>
     <w:p>
@@ -1132,7 +1185,7 @@
         <w:pStyle w:val="ListBullet"/>
       </w:pPr>
       <w:r>
-        <w:t xml:space="preserve">Домен: новый поддомен, не затрагивающий </w:t>
+        <w:t xml:space="preserve">Сайт отдельный и не затрагивает </w:t>
       </w:r>
       <w:r>
         <w:rPr>
@@ -1146,6 +1199,41 @@
       </w:r>
     </w:p>
     <w:p>
+      <w:r>
+        <w:t xml:space="preserve">Технический домен </w:t>
+      </w:r>
+      <w:r>
+        <w:rPr>
+          <w:rFonts w:ascii="Consolas" w:hAnsi="Consolas"/>
+          <w:sz w:val="18"/>
+        </w:rPr>
+        <w:t>nip.io</w:t>
+      </w:r>
+      <w:r>
+        <w:t xml:space="preserve"> выбран потому, что бесплатный аккаунт Alwaysdata</w:t>
+      </w:r>
+    </w:p>
+    <w:p>
+      <w:r>
+        <w:t xml:space="preserve">не позволяет занять произвольное имя в зоне </w:t>
+      </w:r>
+      <w:r>
+        <w:rPr>
+          <w:rFonts w:ascii="Consolas" w:hAnsi="Consolas"/>
+          <w:sz w:val="18"/>
+        </w:rPr>
+        <w:t>alwaysdata.net</w:t>
+      </w:r>
+      <w:r>
+        <w:t>. Для сдачи</w:t>
+      </w:r>
+    </w:p>
+    <w:p>
+      <w:r>
+        <w:t>пилота и промышленной эксплуатации нужен собственный домен.</w:t>
+      </w:r>
+    </w:p>
+    <w:p>
       <w:pPr>
         <w:pStyle w:val="Heading3"/>
       </w:pPr>
@@ -1158,7 +1246,53 @@
         <w:pStyle w:val="ListBullet"/>
       </w:pPr>
       <w:r>
-        <w:t>Отдельная БД и отдельный пользователь.</w:t>
+        <w:t xml:space="preserve">Отдельная БД: </w:t>
+      </w:r>
+      <w:r>
+        <w:rPr>
+          <w:rFonts w:ascii="Consolas" w:hAnsi="Consolas"/>
+          <w:sz w:val="18"/>
+        </w:rPr>
+        <w:t>virusadk_school_platform</w:t>
+      </w:r>
+      <w:r>
+        <w:t>.</w:t>
+      </w:r>
+    </w:p>
+    <w:p>
+      <w:pPr>
+        <w:pStyle w:val="ListBullet"/>
+      </w:pPr>
+      <w:r>
+        <w:t xml:space="preserve">Хост: </w:t>
+      </w:r>
+      <w:r>
+        <w:rPr>
+          <w:rFonts w:ascii="Consolas" w:hAnsi="Consolas"/>
+          <w:sz w:val="18"/>
+        </w:rPr>
+        <w:t>postgresql-virusadk.alwaysdata.net:5432</w:t>
+      </w:r>
+      <w:r>
+        <w:t>.</w:t>
+      </w:r>
+    </w:p>
+    <w:p>
+      <w:pPr>
+        <w:pStyle w:val="ListBullet"/>
+      </w:pPr>
+      <w:r>
+        <w:t xml:space="preserve">Пользователь: </w:t>
+      </w:r>
+      <w:r>
+        <w:rPr>
+          <w:rFonts w:ascii="Consolas" w:hAnsi="Consolas"/>
+          <w:sz w:val="18"/>
+        </w:rPr>
+        <w:t>virusadk</w:t>
+      </w:r>
+      <w:r>
+        <w:t>.</w:t>
       </w:r>
     </w:p>
     <w:p>
@@ -1177,6 +1311,208 @@
       </w:r>
       <w:r>
         <w:t xml:space="preserve"> и менеджере секретов.</w:t>
+      </w:r>
+    </w:p>
+    <w:p>
+      <w:pPr>
+        <w:pStyle w:val="ListBullet"/>
+      </w:pPr>
+      <w:r>
+        <w:t xml:space="preserve">Созданы схемы: </w:t>
+      </w:r>
+      <w:r>
+        <w:rPr>
+          <w:rFonts w:ascii="Consolas" w:hAnsi="Consolas"/>
+          <w:sz w:val="18"/>
+        </w:rPr>
+        <w:t>iam</w:t>
+      </w:r>
+      <w:r>
+        <w:t xml:space="preserve">, </w:t>
+      </w:r>
+      <w:r>
+        <w:rPr>
+          <w:rFonts w:ascii="Consolas" w:hAnsi="Consolas"/>
+          <w:sz w:val="18"/>
+        </w:rPr>
+        <w:t>org</w:t>
+      </w:r>
+      <w:r>
+        <w:t xml:space="preserve">, </w:t>
+      </w:r>
+      <w:r>
+        <w:rPr>
+          <w:rFonts w:ascii="Consolas" w:hAnsi="Consolas"/>
+          <w:sz w:val="18"/>
+        </w:rPr>
+        <w:t>lms</w:t>
+      </w:r>
+      <w:r>
+        <w:t xml:space="preserve">, </w:t>
+      </w:r>
+      <w:r>
+        <w:rPr>
+          <w:rFonts w:ascii="Consolas" w:hAnsi="Consolas"/>
+          <w:sz w:val="18"/>
+        </w:rPr>
+        <w:t>assessment</w:t>
+      </w:r>
+      <w:r>
+        <w:t xml:space="preserve">, </w:t>
+      </w:r>
+      <w:r>
+        <w:rPr>
+          <w:rFonts w:ascii="Consolas" w:hAnsi="Consolas"/>
+          <w:sz w:val="18"/>
+        </w:rPr>
+        <w:t>journal</w:t>
+      </w:r>
+      <w:r>
+        <w:t>,</w:t>
+      </w:r>
+    </w:p>
+    <w:p>
+      <w:r>
+        <w:rPr>
+          <w:rFonts w:ascii="Consolas" w:hAnsi="Consolas"/>
+          <w:sz w:val="18"/>
+        </w:rPr>
+        <w:t>communication</w:t>
+      </w:r>
+      <w:r>
+        <w:t xml:space="preserve">, </w:t>
+      </w:r>
+      <w:r>
+        <w:rPr>
+          <w:rFonts w:ascii="Consolas" w:hAnsi="Consolas"/>
+          <w:sz w:val="18"/>
+        </w:rPr>
+        <w:t>safety</w:t>
+      </w:r>
+      <w:r>
+        <w:t xml:space="preserve">, </w:t>
+      </w:r>
+      <w:r>
+        <w:rPr>
+          <w:rFonts w:ascii="Consolas" w:hAnsi="Consolas"/>
+          <w:sz w:val="18"/>
+        </w:rPr>
+        <w:t>documents</w:t>
+      </w:r>
+      <w:r>
+        <w:t xml:space="preserve">, </w:t>
+      </w:r>
+      <w:r>
+        <w:rPr>
+          <w:rFonts w:ascii="Consolas" w:hAnsi="Consolas"/>
+          <w:sz w:val="18"/>
+        </w:rPr>
+        <w:t>analytics</w:t>
+      </w:r>
+      <w:r>
+        <w:t xml:space="preserve">, </w:t>
+      </w:r>
+      <w:r>
+        <w:rPr>
+          <w:rFonts w:ascii="Consolas" w:hAnsi="Consolas"/>
+          <w:sz w:val="18"/>
+        </w:rPr>
+        <w:t>ai</w:t>
+      </w:r>
+      <w:r>
+        <w:t xml:space="preserve">, </w:t>
+      </w:r>
+      <w:r>
+        <w:rPr>
+          <w:rFonts w:ascii="Consolas" w:hAnsi="Consolas"/>
+          <w:sz w:val="18"/>
+        </w:rPr>
+        <w:t>audit</w:t>
+      </w:r>
+      <w:r>
+        <w:t>,</w:t>
+      </w:r>
+    </w:p>
+    <w:p>
+      <w:r>
+        <w:rPr>
+          <w:rFonts w:ascii="Consolas" w:hAnsi="Consolas"/>
+          <w:sz w:val="18"/>
+        </w:rPr>
+        <w:t>system</w:t>
+      </w:r>
+      <w:r>
+        <w:t>.</w:t>
+      </w:r>
+    </w:p>
+    <w:p>
+      <w:pPr>
+        <w:pStyle w:val="ListBullet"/>
+      </w:pPr>
+      <w:r>
+        <w:t xml:space="preserve">Подключены расширения: </w:t>
+      </w:r>
+      <w:r>
+        <w:rPr>
+          <w:rFonts w:ascii="Consolas" w:hAnsi="Consolas"/>
+          <w:sz w:val="18"/>
+        </w:rPr>
+        <w:t>citext</w:t>
+      </w:r>
+      <w:r>
+        <w:t xml:space="preserve">, </w:t>
+      </w:r>
+      <w:r>
+        <w:rPr>
+          <w:rFonts w:ascii="Consolas" w:hAnsi="Consolas"/>
+          <w:sz w:val="18"/>
+        </w:rPr>
+        <w:t>pgcrypto</w:t>
+      </w:r>
+      <w:r>
+        <w:t xml:space="preserve">, </w:t>
+      </w:r>
+      <w:r>
+        <w:rPr>
+          <w:rFonts w:ascii="Consolas" w:hAnsi="Consolas"/>
+          <w:sz w:val="18"/>
+        </w:rPr>
+        <w:t>pg_trgm</w:t>
+      </w:r>
+      <w:r>
+        <w:t xml:space="preserve">, </w:t>
+      </w:r>
+      <w:r>
+        <w:rPr>
+          <w:rFonts w:ascii="Consolas" w:hAnsi="Consolas"/>
+          <w:sz w:val="18"/>
+        </w:rPr>
+        <w:t>vector</w:t>
+      </w:r>
+      <w:r>
+        <w:t>,</w:t>
+      </w:r>
+    </w:p>
+    <w:p>
+      <w:r>
+        <w:rPr>
+          <w:rFonts w:ascii="Consolas" w:hAnsi="Consolas"/>
+          <w:sz w:val="18"/>
+        </w:rPr>
+        <w:t>unaccent</w:t>
+      </w:r>
+      <w:r>
+        <w:t xml:space="preserve">, </w:t>
+      </w:r>
+      <w:r>
+        <w:rPr>
+          <w:rFonts w:ascii="Consolas" w:hAnsi="Consolas"/>
+          <w:sz w:val="18"/>
+        </w:rPr>
+        <w:t>uuid-ossp</w:t>
+      </w:r>
+      <w:r>
+        <w:t>.</w:t>
       </w:r>
     </w:p>
     <w:p>

</xml_diff>

<commit_message>
docs: mark pilot HTTPS and close stage 0
</commit_message>
<xml_diff>
--- a/docs/word/07-operations/01-razvertyvanie-i-ekspluataciya.docx
+++ b/docs/word/07-operations/01-razvertyvanie-i-ekspluataciya.docx
@@ -27,7 +27,7 @@
           <w:b/>
           <w:sz w:val="36"/>
         </w:rPr>
-        <w:t>Развёртывание и эксплуатация</w:t>
+        <w:t>01-razvertyvanie-i-ekspluataciya</w:t>
       </w:r>
     </w:p>
     <w:p/>
@@ -214,11 +214,8 @@
       </w:r>
     </w:p>
     <w:p>
-      <w:pPr>
-        <w:pStyle w:val="Heading1"/>
-      </w:pPr>
       <w:r>
-        <w:t>Развёртывание и эксплуатация</w:t>
+        <w:t>﻿# Развёртывание и эксплуатация</w:t>
       </w:r>
     </w:p>
     <w:tbl>
@@ -1103,10 +1100,28 @@
           <w:rFonts w:ascii="Consolas" w:hAnsi="Consolas"/>
           <w:sz w:val="18"/>
         </w:rPr>
-        <w:t>http://school-platform-v2.185.31.40.24.nip.io</w:t>
+        <w:t>https://school-platform-v2.185.31.40.24.nip.io</w:t>
       </w:r>
       <w:r>
         <w:t>.</w:t>
+      </w:r>
+    </w:p>
+    <w:p>
+      <w:pPr>
+        <w:pStyle w:val="ListBullet"/>
+      </w:pPr>
+      <w:r>
+        <w:t xml:space="preserve">SSL: Let's Encrypt, срок действия до 2027-01-25, </w:t>
+      </w:r>
+      <w:r>
+        <w:rPr>
+          <w:rFonts w:ascii="Consolas" w:hAnsi="Consolas"/>
+          <w:sz w:val="18"/>
+        </w:rPr>
+        <w:t>Force HTTPS</w:t>
+      </w:r>
+      <w:r>
+        <w:t xml:space="preserve"> включён.</w:t>
       </w:r>
     </w:p>
     <w:p>

</xml_diff>